<commit_message>
Bugs Fix untuk template dan Modal AFK
</commit_message>
<xml_diff>
--- a/frontend/templates/kp-template.docx
+++ b/frontend/templates/kp-template.docx
@@ -388,7 +388,63 @@
                 <w:u w:val="none" w:color="1C1C1C"/>
                 <w:lang w:val="de-DE"/>
               </w:rPr>
-              <w:t>: {{nama}}</w:t>
+              <w:t>: {</w:t>
+            </w:r>
+            <w:r>
+              <w:rPr>
+                <w:b w:val="0"/>
+                <w:bCs w:val="0"/>
+                <w:color w:val="1C1C1C"/>
+                <w:spacing w:val="-2"/>
+                <w:w w:val="90"/>
+                <w:sz w:val="24"/>
+                <w:szCs w:val="24"/>
+                <w:u w:val="none" w:color="1C1C1C"/>
+                <w:lang w:val="de-DE"/>
+              </w:rPr>
+              <w:t>%</w:t>
+            </w:r>
+            <w:r>
+              <w:rPr>
+                <w:b w:val="0"/>
+                <w:bCs w:val="0"/>
+                <w:color w:val="1C1C1C"/>
+                <w:spacing w:val="-2"/>
+                <w:w w:val="90"/>
+                <w:sz w:val="24"/>
+                <w:szCs w:val="24"/>
+                <w:u w:val="none" w:color="1C1C1C"/>
+                <w:lang w:val="de-DE"/>
+              </w:rPr>
+              <w:t>nama</w:t>
+            </w:r>
+            <w:r>
+              <w:rPr>
+                <w:b w:val="0"/>
+                <w:bCs w:val="0"/>
+                <w:color w:val="1C1C1C"/>
+                <w:spacing w:val="-2"/>
+                <w:w w:val="90"/>
+                <w:sz w:val="24"/>
+                <w:szCs w:val="24"/>
+                <w:u w:val="none" w:color="1C1C1C"/>
+                <w:lang w:val="de-DE"/>
+              </w:rPr>
+              <w:t>%</w:t>
+            </w:r>
+            <w:r>
+              <w:rPr>
+                <w:b w:val="0"/>
+                <w:bCs w:val="0"/>
+                <w:color w:val="1C1C1C"/>
+                <w:spacing w:val="-2"/>
+                <w:w w:val="90"/>
+                <w:sz w:val="24"/>
+                <w:szCs w:val="24"/>
+                <w:u w:val="none" w:color="1C1C1C"/>
+                <w:lang w:val="de-DE"/>
+              </w:rPr>
+              <w:t>}</w:t>
             </w:r>
           </w:p>
         </w:tc>
@@ -464,7 +520,63 @@
                 <w:u w:val="none" w:color="1C1C1C"/>
                 <w:lang w:val="de-DE"/>
               </w:rPr>
-              <w:t>: {{nim}}</w:t>
+              <w:t>: {</w:t>
+            </w:r>
+            <w:r>
+              <w:rPr>
+                <w:b w:val="0"/>
+                <w:bCs w:val="0"/>
+                <w:color w:val="1C1C1C"/>
+                <w:spacing w:val="-2"/>
+                <w:w w:val="90"/>
+                <w:sz w:val="24"/>
+                <w:szCs w:val="24"/>
+                <w:u w:val="none" w:color="1C1C1C"/>
+                <w:lang w:val="de-DE"/>
+              </w:rPr>
+              <w:t>%</w:t>
+            </w:r>
+            <w:r>
+              <w:rPr>
+                <w:b w:val="0"/>
+                <w:bCs w:val="0"/>
+                <w:color w:val="1C1C1C"/>
+                <w:spacing w:val="-2"/>
+                <w:w w:val="90"/>
+                <w:sz w:val="24"/>
+                <w:szCs w:val="24"/>
+                <w:u w:val="none" w:color="1C1C1C"/>
+                <w:lang w:val="de-DE"/>
+              </w:rPr>
+              <w:t>nim</w:t>
+            </w:r>
+            <w:r>
+              <w:rPr>
+                <w:b w:val="0"/>
+                <w:bCs w:val="0"/>
+                <w:color w:val="1C1C1C"/>
+                <w:spacing w:val="-2"/>
+                <w:w w:val="90"/>
+                <w:sz w:val="24"/>
+                <w:szCs w:val="24"/>
+                <w:u w:val="none" w:color="1C1C1C"/>
+                <w:lang w:val="de-DE"/>
+              </w:rPr>
+              <w:t>%</w:t>
+            </w:r>
+            <w:r>
+              <w:rPr>
+                <w:b w:val="0"/>
+                <w:bCs w:val="0"/>
+                <w:color w:val="1C1C1C"/>
+                <w:spacing w:val="-2"/>
+                <w:w w:val="90"/>
+                <w:sz w:val="24"/>
+                <w:szCs w:val="24"/>
+                <w:u w:val="none" w:color="1C1C1C"/>
+                <w:lang w:val="de-DE"/>
+              </w:rPr>
+              <w:t>}</w:t>
             </w:r>
           </w:p>
         </w:tc>
@@ -502,8 +614,23 @@
                 <w:szCs w:val="24"/>
                 <w:u w:val="none" w:color="1C1C1C"/>
               </w:rPr>
-              <w:t>No WA / Telepon</w:t>
-            </w:r>
+              <w:t xml:space="preserve">No WA / </w:t>
+            </w:r>
+            <w:proofErr w:type="spellStart"/>
+            <w:r>
+              <w:rPr>
+                <w:b w:val="0"/>
+                <w:bCs w:val="0"/>
+                <w:color w:val="1C1C1C"/>
+                <w:spacing w:val="-2"/>
+                <w:w w:val="90"/>
+                <w:sz w:val="24"/>
+                <w:szCs w:val="24"/>
+                <w:u w:val="none" w:color="1C1C1C"/>
+              </w:rPr>
+              <w:t>Telepon</w:t>
+            </w:r>
+            <w:proofErr w:type="spellEnd"/>
           </w:p>
         </w:tc>
         <w:tc>
@@ -551,7 +678,61 @@
                 <w:szCs w:val="24"/>
                 <w:u w:val="none" w:color="1C1C1C"/>
               </w:rPr>
-              <w:t>{{nomor}}</w:t>
+              <w:t>{</w:t>
+            </w:r>
+            <w:r>
+              <w:rPr>
+                <w:b w:val="0"/>
+                <w:bCs w:val="0"/>
+                <w:color w:val="1C1C1C"/>
+                <w:spacing w:val="-2"/>
+                <w:w w:val="90"/>
+                <w:sz w:val="24"/>
+                <w:szCs w:val="24"/>
+                <w:u w:val="none" w:color="1C1C1C"/>
+              </w:rPr>
+              <w:t>%</w:t>
+            </w:r>
+            <w:proofErr w:type="spellStart"/>
+            <w:r>
+              <w:rPr>
+                <w:b w:val="0"/>
+                <w:bCs w:val="0"/>
+                <w:color w:val="1C1C1C"/>
+                <w:spacing w:val="-2"/>
+                <w:w w:val="90"/>
+                <w:sz w:val="24"/>
+                <w:szCs w:val="24"/>
+                <w:u w:val="none" w:color="1C1C1C"/>
+              </w:rPr>
+              <w:t>nomor</w:t>
+            </w:r>
+            <w:proofErr w:type="spellEnd"/>
+            <w:r>
+              <w:rPr>
+                <w:b w:val="0"/>
+                <w:bCs w:val="0"/>
+                <w:color w:val="1C1C1C"/>
+                <w:spacing w:val="-2"/>
+                <w:w w:val="90"/>
+                <w:sz w:val="24"/>
+                <w:szCs w:val="24"/>
+                <w:u w:val="none" w:color="1C1C1C"/>
+              </w:rPr>
+              <w:t>%</w:t>
+            </w:r>
+            <w:r>
+              <w:rPr>
+                <w:b w:val="0"/>
+                <w:bCs w:val="0"/>
+                <w:color w:val="1C1C1C"/>
+                <w:spacing w:val="-2"/>
+                <w:w w:val="90"/>
+                <w:sz w:val="24"/>
+                <w:szCs w:val="24"/>
+                <w:u w:val="none" w:color="1C1C1C"/>
+              </w:rPr>
+              <w:t>}</w:t>
             </w:r>
           </w:p>
         </w:tc>
@@ -651,7 +832,61 @@
                 <w:szCs w:val="24"/>
                 <w:u w:val="none" w:color="1C1C1C"/>
               </w:rPr>
-              <w:t>{{sksIPK}}</w:t>
+              <w:t>{</w:t>
+            </w:r>
+            <w:r>
+              <w:rPr>
+                <w:b w:val="0"/>
+                <w:bCs w:val="0"/>
+                <w:color w:val="1C1C1C"/>
+                <w:spacing w:val="-2"/>
+                <w:w w:val="90"/>
+                <w:sz w:val="24"/>
+                <w:szCs w:val="24"/>
+                <w:u w:val="none" w:color="1C1C1C"/>
+              </w:rPr>
+              <w:t>%</w:t>
+            </w:r>
+            <w:proofErr w:type="spellStart"/>
+            <w:r>
+              <w:rPr>
+                <w:b w:val="0"/>
+                <w:bCs w:val="0"/>
+                <w:color w:val="1C1C1C"/>
+                <w:spacing w:val="-2"/>
+                <w:w w:val="90"/>
+                <w:sz w:val="24"/>
+                <w:szCs w:val="24"/>
+                <w:u w:val="none" w:color="1C1C1C"/>
+              </w:rPr>
+              <w:t>sksIPK</w:t>
+            </w:r>
+            <w:proofErr w:type="spellEnd"/>
+            <w:r>
+              <w:rPr>
+                <w:b w:val="0"/>
+                <w:bCs w:val="0"/>
+                <w:color w:val="1C1C1C"/>
+                <w:spacing w:val="-2"/>
+                <w:w w:val="90"/>
+                <w:sz w:val="24"/>
+                <w:szCs w:val="24"/>
+                <w:u w:val="none" w:color="1C1C1C"/>
+              </w:rPr>
+              <w:t>%</w:t>
+            </w:r>
+            <w:r>
+              <w:rPr>
+                <w:b w:val="0"/>
+                <w:bCs w:val="0"/>
+                <w:color w:val="1C1C1C"/>
+                <w:spacing w:val="-2"/>
+                <w:w w:val="90"/>
+                <w:sz w:val="24"/>
+                <w:szCs w:val="24"/>
+                <w:u w:val="none" w:color="1C1C1C"/>
+              </w:rPr>
+              <w:t>}</w:t>
             </w:r>
           </w:p>
         </w:tc>
@@ -747,20 +982,175 @@
           <w:szCs w:val="24"/>
           <w:u w:val="none" w:color="1C1C1C"/>
         </w:rPr>
-        <w:t xml:space="preserve">Bersama ini pula saya </w:t>
-      </w:r>
-      <w:r>
-        <w:rPr>
-          <w:b w:val="0"/>
-          <w:bCs w:val="0"/>
-          <w:color w:val="1C1C1C"/>
-          <w:spacing w:val="-2"/>
-          <w:w w:val="90"/>
-          <w:sz w:val="24"/>
-          <w:szCs w:val="24"/>
-          <w:u w:val="none" w:color="1C1C1C"/>
-        </w:rPr>
-        <w:t>lampirkan persyaratan sebagai berikut:</w:t>
+        <w:t xml:space="preserve">Bersama </w:t>
+      </w:r>
+      <w:proofErr w:type="spellStart"/>
+      <w:r>
+        <w:rPr>
+          <w:b w:val="0"/>
+          <w:bCs w:val="0"/>
+          <w:color w:val="1C1C1C"/>
+          <w:spacing w:val="-2"/>
+          <w:w w:val="90"/>
+          <w:sz w:val="24"/>
+          <w:szCs w:val="24"/>
+          <w:u w:val="none" w:color="1C1C1C"/>
+        </w:rPr>
+        <w:t>ini</w:t>
+      </w:r>
+      <w:proofErr w:type="spellEnd"/>
+      <w:r>
+        <w:rPr>
+          <w:b w:val="0"/>
+          <w:bCs w:val="0"/>
+          <w:color w:val="1C1C1C"/>
+          <w:spacing w:val="-2"/>
+          <w:w w:val="90"/>
+          <w:sz w:val="24"/>
+          <w:szCs w:val="24"/>
+          <w:u w:val="none" w:color="1C1C1C"/>
+        </w:rPr>
+        <w:t xml:space="preserve"> pula </w:t>
+      </w:r>
+      <w:proofErr w:type="spellStart"/>
+      <w:r>
+        <w:rPr>
+          <w:b w:val="0"/>
+          <w:bCs w:val="0"/>
+          <w:color w:val="1C1C1C"/>
+          <w:spacing w:val="-2"/>
+          <w:w w:val="90"/>
+          <w:sz w:val="24"/>
+          <w:szCs w:val="24"/>
+          <w:u w:val="none" w:color="1C1C1C"/>
+        </w:rPr>
+        <w:t>saya</w:t>
+      </w:r>
+      <w:proofErr w:type="spellEnd"/>
+      <w:r>
+        <w:rPr>
+          <w:b w:val="0"/>
+          <w:bCs w:val="0"/>
+          <w:color w:val="1C1C1C"/>
+          <w:spacing w:val="-2"/>
+          <w:w w:val="90"/>
+          <w:sz w:val="24"/>
+          <w:szCs w:val="24"/>
+          <w:u w:val="none" w:color="1C1C1C"/>
+        </w:rPr>
+        <w:t xml:space="preserve"> </w:t>
+      </w:r>
+      <w:proofErr w:type="spellStart"/>
+      <w:r>
+        <w:rPr>
+          <w:b w:val="0"/>
+          <w:bCs w:val="0"/>
+          <w:color w:val="1C1C1C"/>
+          <w:spacing w:val="-2"/>
+          <w:w w:val="90"/>
+          <w:sz w:val="24"/>
+          <w:szCs w:val="24"/>
+          <w:u w:val="none" w:color="1C1C1C"/>
+        </w:rPr>
+        <w:t>lampirkan</w:t>
+      </w:r>
+      <w:proofErr w:type="spellEnd"/>
+      <w:r>
+        <w:rPr>
+          <w:b w:val="0"/>
+          <w:bCs w:val="0"/>
+          <w:color w:val="1C1C1C"/>
+          <w:spacing w:val="-2"/>
+          <w:w w:val="90"/>
+          <w:sz w:val="24"/>
+          <w:szCs w:val="24"/>
+          <w:u w:val="none" w:color="1C1C1C"/>
+        </w:rPr>
+        <w:t xml:space="preserve"> </w:t>
+      </w:r>
+      <w:proofErr w:type="spellStart"/>
+      <w:r>
+        <w:rPr>
+          <w:b w:val="0"/>
+          <w:bCs w:val="0"/>
+          <w:color w:val="1C1C1C"/>
+          <w:spacing w:val="-2"/>
+          <w:w w:val="90"/>
+          <w:sz w:val="24"/>
+          <w:szCs w:val="24"/>
+          <w:u w:val="none" w:color="1C1C1C"/>
+        </w:rPr>
+        <w:t>persyaratan</w:t>
+      </w:r>
+      <w:proofErr w:type="spellEnd"/>
+      <w:r>
+        <w:rPr>
+          <w:b w:val="0"/>
+          <w:bCs w:val="0"/>
+          <w:color w:val="1C1C1C"/>
+          <w:spacing w:val="-2"/>
+          <w:w w:val="90"/>
+          <w:sz w:val="24"/>
+          <w:szCs w:val="24"/>
+          <w:u w:val="none" w:color="1C1C1C"/>
+        </w:rPr>
+        <w:t xml:space="preserve"> </w:t>
+      </w:r>
+      <w:proofErr w:type="spellStart"/>
+      <w:r>
+        <w:rPr>
+          <w:b w:val="0"/>
+          <w:bCs w:val="0"/>
+          <w:color w:val="1C1C1C"/>
+          <w:spacing w:val="-2"/>
+          <w:w w:val="90"/>
+          <w:sz w:val="24"/>
+          <w:szCs w:val="24"/>
+          <w:u w:val="none" w:color="1C1C1C"/>
+        </w:rPr>
+        <w:t>sebagai</w:t>
+      </w:r>
+      <w:proofErr w:type="spellEnd"/>
+      <w:r>
+        <w:rPr>
+          <w:b w:val="0"/>
+          <w:bCs w:val="0"/>
+          <w:color w:val="1C1C1C"/>
+          <w:spacing w:val="-2"/>
+          <w:w w:val="90"/>
+          <w:sz w:val="24"/>
+          <w:szCs w:val="24"/>
+          <w:u w:val="none" w:color="1C1C1C"/>
+        </w:rPr>
+        <w:t xml:space="preserve"> </w:t>
+      </w:r>
+      <w:proofErr w:type="spellStart"/>
+      <w:r>
+        <w:rPr>
+          <w:b w:val="0"/>
+          <w:bCs w:val="0"/>
+          <w:color w:val="1C1C1C"/>
+          <w:spacing w:val="-2"/>
+          <w:w w:val="90"/>
+          <w:sz w:val="24"/>
+          <w:szCs w:val="24"/>
+          <w:u w:val="none" w:color="1C1C1C"/>
+        </w:rPr>
+        <w:t>berikut</w:t>
+      </w:r>
+      <w:proofErr w:type="spellEnd"/>
+      <w:r>
+        <w:rPr>
+          <w:b w:val="0"/>
+          <w:bCs w:val="0"/>
+          <w:color w:val="1C1C1C"/>
+          <w:spacing w:val="-2"/>
+          <w:w w:val="90"/>
+          <w:sz w:val="24"/>
+          <w:szCs w:val="24"/>
+          <w:u w:val="none" w:color="1C1C1C"/>
+        </w:rPr>
+        <w:t>:</w:t>
       </w:r>
       <w:r>
         <w:rPr>
@@ -835,6 +1225,7 @@
                 <w:u w:val="none" w:color="1C1C1C"/>
               </w:rPr>
             </w:pPr>
+            <w:proofErr w:type="spellStart"/>
             <w:r>
               <w:rPr>
                 <w:color w:val="1C1C1C"/>
@@ -846,6 +1237,7 @@
               </w:rPr>
               <w:t>Persyaratan</w:t>
             </w:r>
+            <w:proofErr w:type="spellEnd"/>
           </w:p>
         </w:tc>
         <w:tc>
@@ -865,6 +1257,7 @@
                 <w:u w:val="none" w:color="1C1C1C"/>
               </w:rPr>
             </w:pPr>
+            <w:proofErr w:type="spellStart"/>
             <w:r>
               <w:rPr>
                 <w:color w:val="1C1C1C"/>
@@ -876,6 +1269,7 @@
               </w:rPr>
               <w:t>Keterangan</w:t>
             </w:r>
+            <w:proofErr w:type="spellEnd"/>
           </w:p>
         </w:tc>
       </w:tr>
@@ -1163,31 +1557,326 @@
           <w:u w:val="none" w:color="1C1C1C"/>
         </w:rPr>
       </w:pPr>
-      <w:r>
-        <w:rPr>
-          <w:b w:val="0"/>
-          <w:bCs w:val="0"/>
-          <w:color w:val="1C1C1C"/>
-          <w:spacing w:val="-2"/>
-          <w:w w:val="90"/>
-          <w:sz w:val="24"/>
-          <w:szCs w:val="24"/>
-          <w:u w:val="none" w:color="1C1C1C"/>
-        </w:rPr>
-        <w:t>Demikian permohonan ini saya sampaikan,</w:t>
-      </w:r>
-      <w:r>
-        <w:rPr>
-          <w:b w:val="0"/>
-          <w:bCs w:val="0"/>
-          <w:color w:val="1C1C1C"/>
-          <w:spacing w:val="-2"/>
-          <w:w w:val="90"/>
-          <w:sz w:val="24"/>
-          <w:szCs w:val="24"/>
-          <w:u w:val="none" w:color="1C1C1C"/>
-        </w:rPr>
-        <w:t xml:space="preserve"> atas perhatian dan perkenannya saya ucapkan terimakasih.</w:t>
+      <w:proofErr w:type="spellStart"/>
+      <w:r>
+        <w:rPr>
+          <w:b w:val="0"/>
+          <w:bCs w:val="0"/>
+          <w:color w:val="1C1C1C"/>
+          <w:spacing w:val="-2"/>
+          <w:w w:val="90"/>
+          <w:sz w:val="24"/>
+          <w:szCs w:val="24"/>
+          <w:u w:val="none" w:color="1C1C1C"/>
+        </w:rPr>
+        <w:t>Demikian</w:t>
+      </w:r>
+      <w:proofErr w:type="spellEnd"/>
+      <w:r>
+        <w:rPr>
+          <w:b w:val="0"/>
+          <w:bCs w:val="0"/>
+          <w:color w:val="1C1C1C"/>
+          <w:spacing w:val="-2"/>
+          <w:w w:val="90"/>
+          <w:sz w:val="24"/>
+          <w:szCs w:val="24"/>
+          <w:u w:val="none" w:color="1C1C1C"/>
+        </w:rPr>
+        <w:t xml:space="preserve"> </w:t>
+      </w:r>
+      <w:proofErr w:type="spellStart"/>
+      <w:r>
+        <w:rPr>
+          <w:b w:val="0"/>
+          <w:bCs w:val="0"/>
+          <w:color w:val="1C1C1C"/>
+          <w:spacing w:val="-2"/>
+          <w:w w:val="90"/>
+          <w:sz w:val="24"/>
+          <w:szCs w:val="24"/>
+          <w:u w:val="none" w:color="1C1C1C"/>
+        </w:rPr>
+        <w:t>permohonan</w:t>
+      </w:r>
+      <w:proofErr w:type="spellEnd"/>
+      <w:r>
+        <w:rPr>
+          <w:b w:val="0"/>
+          <w:bCs w:val="0"/>
+          <w:color w:val="1C1C1C"/>
+          <w:spacing w:val="-2"/>
+          <w:w w:val="90"/>
+          <w:sz w:val="24"/>
+          <w:szCs w:val="24"/>
+          <w:u w:val="none" w:color="1C1C1C"/>
+        </w:rPr>
+        <w:t xml:space="preserve"> </w:t>
+      </w:r>
+      <w:proofErr w:type="spellStart"/>
+      <w:r>
+        <w:rPr>
+          <w:b w:val="0"/>
+          <w:bCs w:val="0"/>
+          <w:color w:val="1C1C1C"/>
+          <w:spacing w:val="-2"/>
+          <w:w w:val="90"/>
+          <w:sz w:val="24"/>
+          <w:szCs w:val="24"/>
+          <w:u w:val="none" w:color="1C1C1C"/>
+        </w:rPr>
+        <w:t>ini</w:t>
+      </w:r>
+      <w:proofErr w:type="spellEnd"/>
+      <w:r>
+        <w:rPr>
+          <w:b w:val="0"/>
+          <w:bCs w:val="0"/>
+          <w:color w:val="1C1C1C"/>
+          <w:spacing w:val="-2"/>
+          <w:w w:val="90"/>
+          <w:sz w:val="24"/>
+          <w:szCs w:val="24"/>
+          <w:u w:val="none" w:color="1C1C1C"/>
+        </w:rPr>
+        <w:t xml:space="preserve"> </w:t>
+      </w:r>
+      <w:proofErr w:type="spellStart"/>
+      <w:r>
+        <w:rPr>
+          <w:b w:val="0"/>
+          <w:bCs w:val="0"/>
+          <w:color w:val="1C1C1C"/>
+          <w:spacing w:val="-2"/>
+          <w:w w:val="90"/>
+          <w:sz w:val="24"/>
+          <w:szCs w:val="24"/>
+          <w:u w:val="none" w:color="1C1C1C"/>
+        </w:rPr>
+        <w:t>saya</w:t>
+      </w:r>
+      <w:proofErr w:type="spellEnd"/>
+      <w:r>
+        <w:rPr>
+          <w:b w:val="0"/>
+          <w:bCs w:val="0"/>
+          <w:color w:val="1C1C1C"/>
+          <w:spacing w:val="-2"/>
+          <w:w w:val="90"/>
+          <w:sz w:val="24"/>
+          <w:szCs w:val="24"/>
+          <w:u w:val="none" w:color="1C1C1C"/>
+        </w:rPr>
+        <w:t xml:space="preserve"> </w:t>
+      </w:r>
+      <w:proofErr w:type="spellStart"/>
+      <w:r>
+        <w:rPr>
+          <w:b w:val="0"/>
+          <w:bCs w:val="0"/>
+          <w:color w:val="1C1C1C"/>
+          <w:spacing w:val="-2"/>
+          <w:w w:val="90"/>
+          <w:sz w:val="24"/>
+          <w:szCs w:val="24"/>
+          <w:u w:val="none" w:color="1C1C1C"/>
+        </w:rPr>
+        <w:t>sampaikan</w:t>
+      </w:r>
+      <w:proofErr w:type="spellEnd"/>
+      <w:r>
+        <w:rPr>
+          <w:b w:val="0"/>
+          <w:bCs w:val="0"/>
+          <w:color w:val="1C1C1C"/>
+          <w:spacing w:val="-2"/>
+          <w:w w:val="90"/>
+          <w:sz w:val="24"/>
+          <w:szCs w:val="24"/>
+          <w:u w:val="none" w:color="1C1C1C"/>
+        </w:rPr>
+        <w:t>,</w:t>
+      </w:r>
+      <w:r>
+        <w:rPr>
+          <w:b w:val="0"/>
+          <w:bCs w:val="0"/>
+          <w:color w:val="1C1C1C"/>
+          <w:spacing w:val="-2"/>
+          <w:w w:val="90"/>
+          <w:sz w:val="24"/>
+          <w:szCs w:val="24"/>
+          <w:u w:val="none" w:color="1C1C1C"/>
+        </w:rPr>
+        <w:t xml:space="preserve"> </w:t>
+      </w:r>
+      <w:proofErr w:type="spellStart"/>
+      <w:r>
+        <w:rPr>
+          <w:b w:val="0"/>
+          <w:bCs w:val="0"/>
+          <w:color w:val="1C1C1C"/>
+          <w:spacing w:val="-2"/>
+          <w:w w:val="90"/>
+          <w:sz w:val="24"/>
+          <w:szCs w:val="24"/>
+          <w:u w:val="none" w:color="1C1C1C"/>
+        </w:rPr>
+        <w:t>atas</w:t>
+      </w:r>
+      <w:proofErr w:type="spellEnd"/>
+      <w:r>
+        <w:rPr>
+          <w:b w:val="0"/>
+          <w:bCs w:val="0"/>
+          <w:color w:val="1C1C1C"/>
+          <w:spacing w:val="-2"/>
+          <w:w w:val="90"/>
+          <w:sz w:val="24"/>
+          <w:szCs w:val="24"/>
+          <w:u w:val="none" w:color="1C1C1C"/>
+        </w:rPr>
+        <w:t xml:space="preserve"> </w:t>
+      </w:r>
+      <w:proofErr w:type="spellStart"/>
+      <w:r>
+        <w:rPr>
+          <w:b w:val="0"/>
+          <w:bCs w:val="0"/>
+          <w:color w:val="1C1C1C"/>
+          <w:spacing w:val="-2"/>
+          <w:w w:val="90"/>
+          <w:sz w:val="24"/>
+          <w:szCs w:val="24"/>
+          <w:u w:val="none" w:color="1C1C1C"/>
+        </w:rPr>
+        <w:t>perhatian</w:t>
+      </w:r>
+      <w:proofErr w:type="spellEnd"/>
+      <w:r>
+        <w:rPr>
+          <w:b w:val="0"/>
+          <w:bCs w:val="0"/>
+          <w:color w:val="1C1C1C"/>
+          <w:spacing w:val="-2"/>
+          <w:w w:val="90"/>
+          <w:sz w:val="24"/>
+          <w:szCs w:val="24"/>
+          <w:u w:val="none" w:color="1C1C1C"/>
+        </w:rPr>
+        <w:t xml:space="preserve"> dan </w:t>
+      </w:r>
+      <w:proofErr w:type="spellStart"/>
+      <w:r>
+        <w:rPr>
+          <w:b w:val="0"/>
+          <w:bCs w:val="0"/>
+          <w:color w:val="1C1C1C"/>
+          <w:spacing w:val="-2"/>
+          <w:w w:val="90"/>
+          <w:sz w:val="24"/>
+          <w:szCs w:val="24"/>
+          <w:u w:val="none" w:color="1C1C1C"/>
+        </w:rPr>
+        <w:t>perkenannya</w:t>
+      </w:r>
+      <w:proofErr w:type="spellEnd"/>
+      <w:r>
+        <w:rPr>
+          <w:b w:val="0"/>
+          <w:bCs w:val="0"/>
+          <w:color w:val="1C1C1C"/>
+          <w:spacing w:val="-2"/>
+          <w:w w:val="90"/>
+          <w:sz w:val="24"/>
+          <w:szCs w:val="24"/>
+          <w:u w:val="none" w:color="1C1C1C"/>
+        </w:rPr>
+        <w:t xml:space="preserve"> </w:t>
+      </w:r>
+      <w:proofErr w:type="spellStart"/>
+      <w:r>
+        <w:rPr>
+          <w:b w:val="0"/>
+          <w:bCs w:val="0"/>
+          <w:color w:val="1C1C1C"/>
+          <w:spacing w:val="-2"/>
+          <w:w w:val="90"/>
+          <w:sz w:val="24"/>
+          <w:szCs w:val="24"/>
+          <w:u w:val="none" w:color="1C1C1C"/>
+        </w:rPr>
+        <w:t>saya</w:t>
+      </w:r>
+      <w:proofErr w:type="spellEnd"/>
+      <w:r>
+        <w:rPr>
+          <w:b w:val="0"/>
+          <w:bCs w:val="0"/>
+          <w:color w:val="1C1C1C"/>
+          <w:spacing w:val="-2"/>
+          <w:w w:val="90"/>
+          <w:sz w:val="24"/>
+          <w:szCs w:val="24"/>
+          <w:u w:val="none" w:color="1C1C1C"/>
+        </w:rPr>
+        <w:t xml:space="preserve"> </w:t>
+      </w:r>
+      <w:proofErr w:type="spellStart"/>
+      <w:r>
+        <w:rPr>
+          <w:b w:val="0"/>
+          <w:bCs w:val="0"/>
+          <w:color w:val="1C1C1C"/>
+          <w:spacing w:val="-2"/>
+          <w:w w:val="90"/>
+          <w:sz w:val="24"/>
+          <w:szCs w:val="24"/>
+          <w:u w:val="none" w:color="1C1C1C"/>
+        </w:rPr>
+        <w:t>ucapkan</w:t>
+      </w:r>
+      <w:proofErr w:type="spellEnd"/>
+      <w:r>
+        <w:rPr>
+          <w:b w:val="0"/>
+          <w:bCs w:val="0"/>
+          <w:color w:val="1C1C1C"/>
+          <w:spacing w:val="-2"/>
+          <w:w w:val="90"/>
+          <w:sz w:val="24"/>
+          <w:szCs w:val="24"/>
+          <w:u w:val="none" w:color="1C1C1C"/>
+        </w:rPr>
+        <w:t xml:space="preserve"> </w:t>
+      </w:r>
+      <w:proofErr w:type="spellStart"/>
+      <w:r>
+        <w:rPr>
+          <w:b w:val="0"/>
+          <w:bCs w:val="0"/>
+          <w:color w:val="1C1C1C"/>
+          <w:spacing w:val="-2"/>
+          <w:w w:val="90"/>
+          <w:sz w:val="24"/>
+          <w:szCs w:val="24"/>
+          <w:u w:val="none" w:color="1C1C1C"/>
+        </w:rPr>
+        <w:t>terimakasih</w:t>
+      </w:r>
+      <w:proofErr w:type="spellEnd"/>
+      <w:r>
+        <w:rPr>
+          <w:b w:val="0"/>
+          <w:bCs w:val="0"/>
+          <w:color w:val="1C1C1C"/>
+          <w:spacing w:val="-2"/>
+          <w:w w:val="90"/>
+          <w:sz w:val="24"/>
+          <w:szCs w:val="24"/>
+          <w:u w:val="none" w:color="1C1C1C"/>
+        </w:rPr>
+        <w:t>.</w:t>
       </w:r>
     </w:p>
     <w:p>
@@ -1208,6 +1897,7 @@
           <w:u w:val="none" w:color="1C1C1C"/>
         </w:rPr>
       </w:pPr>
+      <w:proofErr w:type="spellStart"/>
       <w:r>
         <w:rPr>
           <w:b w:val="0"/>
@@ -1221,7 +1911,87 @@
           <w:szCs w:val="24"/>
           <w:u w:val="none" w:color="1C1C1C"/>
         </w:rPr>
-        <w:t>Wassalamu’alaikum warahmatullahi wabarakatuh.</w:t>
+        <w:t>Wassalamu’alaikum</w:t>
+      </w:r>
+      <w:proofErr w:type="spellEnd"/>
+      <w:r>
+        <w:rPr>
+          <w:b w:val="0"/>
+          <w:bCs w:val="0"/>
+          <w:i/>
+          <w:iCs/>
+          <w:color w:val="1C1C1C"/>
+          <w:spacing w:val="-2"/>
+          <w:w w:val="90"/>
+          <w:sz w:val="24"/>
+          <w:szCs w:val="24"/>
+          <w:u w:val="none" w:color="1C1C1C"/>
+        </w:rPr>
+        <w:t xml:space="preserve"> </w:t>
+      </w:r>
+      <w:proofErr w:type="spellStart"/>
+      <w:r>
+        <w:rPr>
+          <w:b w:val="0"/>
+          <w:bCs w:val="0"/>
+          <w:i/>
+          <w:iCs/>
+          <w:color w:val="1C1C1C"/>
+          <w:spacing w:val="-2"/>
+          <w:w w:val="90"/>
+          <w:sz w:val="24"/>
+          <w:szCs w:val="24"/>
+          <w:u w:val="none" w:color="1C1C1C"/>
+        </w:rPr>
+        <w:t>warahmatullahi</w:t>
+      </w:r>
+      <w:proofErr w:type="spellEnd"/>
+      <w:r>
+        <w:rPr>
+          <w:b w:val="0"/>
+          <w:bCs w:val="0"/>
+          <w:i/>
+          <w:iCs/>
+          <w:color w:val="1C1C1C"/>
+          <w:spacing w:val="-2"/>
+          <w:w w:val="90"/>
+          <w:sz w:val="24"/>
+          <w:szCs w:val="24"/>
+          <w:u w:val="none" w:color="1C1C1C"/>
+        </w:rPr>
+        <w:t xml:space="preserve"> </w:t>
+      </w:r>
+      <w:proofErr w:type="spellStart"/>
+      <w:r>
+        <w:rPr>
+          <w:b w:val="0"/>
+          <w:bCs w:val="0"/>
+          <w:i/>
+          <w:iCs/>
+          <w:color w:val="1C1C1C"/>
+          <w:spacing w:val="-2"/>
+          <w:w w:val="90"/>
+          <w:sz w:val="24"/>
+          <w:szCs w:val="24"/>
+          <w:u w:val="none" w:color="1C1C1C"/>
+        </w:rPr>
+        <w:t>wabarakatuh</w:t>
+      </w:r>
+      <w:proofErr w:type="spellEnd"/>
+      <w:r>
+        <w:rPr>
+          <w:b w:val="0"/>
+          <w:bCs w:val="0"/>
+          <w:i/>
+          <w:iCs/>
+          <w:color w:val="1C1C1C"/>
+          <w:spacing w:val="-2"/>
+          <w:w w:val="90"/>
+          <w:sz w:val="24"/>
+          <w:szCs w:val="24"/>
+          <w:u w:val="none" w:color="1C1C1C"/>
+        </w:rPr>
+        <w:t>.</w:t>
       </w:r>
     </w:p>
     <w:p>
@@ -1325,7 +2095,61 @@
                 <w:szCs w:val="24"/>
                 <w:u w:val="none" w:color="1C1C1C"/>
               </w:rPr>
-              <w:t>{{tanggal}}</w:t>
+              <w:t>{</w:t>
+            </w:r>
+            <w:r>
+              <w:rPr>
+                <w:b w:val="0"/>
+                <w:bCs w:val="0"/>
+                <w:color w:val="1C1C1C"/>
+                <w:spacing w:val="-2"/>
+                <w:w w:val="90"/>
+                <w:sz w:val="24"/>
+                <w:szCs w:val="24"/>
+                <w:u w:val="none" w:color="1C1C1C"/>
+              </w:rPr>
+              <w:t>%</w:t>
+            </w:r>
+            <w:proofErr w:type="spellStart"/>
+            <w:r>
+              <w:rPr>
+                <w:b w:val="0"/>
+                <w:bCs w:val="0"/>
+                <w:color w:val="1C1C1C"/>
+                <w:spacing w:val="-2"/>
+                <w:w w:val="90"/>
+                <w:sz w:val="24"/>
+                <w:szCs w:val="24"/>
+                <w:u w:val="none" w:color="1C1C1C"/>
+              </w:rPr>
+              <w:t>tanggal</w:t>
+            </w:r>
+            <w:proofErr w:type="spellEnd"/>
+            <w:r>
+              <w:rPr>
+                <w:b w:val="0"/>
+                <w:bCs w:val="0"/>
+                <w:color w:val="1C1C1C"/>
+                <w:spacing w:val="-2"/>
+                <w:w w:val="90"/>
+                <w:sz w:val="24"/>
+                <w:szCs w:val="24"/>
+                <w:u w:val="none" w:color="1C1C1C"/>
+              </w:rPr>
+              <w:t>%</w:t>
+            </w:r>
+            <w:r>
+              <w:rPr>
+                <w:b w:val="0"/>
+                <w:bCs w:val="0"/>
+                <w:color w:val="1C1C1C"/>
+                <w:spacing w:val="-2"/>
+                <w:w w:val="90"/>
+                <w:sz w:val="24"/>
+                <w:szCs w:val="24"/>
+                <w:u w:val="none" w:color="1C1C1C"/>
+              </w:rPr>
+              <w:t>}</w:t>
             </w:r>
           </w:p>
         </w:tc>
@@ -1372,18 +2196,33 @@
                 <w:u w:val="none" w:color="1C1C1C"/>
               </w:rPr>
             </w:pPr>
-            <w:r>
-              <w:rPr>
-                <w:b w:val="0"/>
-                <w:bCs w:val="0"/>
-                <w:color w:val="1C1C1C"/>
-                <w:spacing w:val="-2"/>
-                <w:w w:val="90"/>
-                <w:sz w:val="24"/>
-                <w:szCs w:val="24"/>
-                <w:u w:val="none" w:color="1C1C1C"/>
-              </w:rPr>
-              <w:t>Pemohon,</w:t>
+            <w:proofErr w:type="spellStart"/>
+            <w:r>
+              <w:rPr>
+                <w:b w:val="0"/>
+                <w:bCs w:val="0"/>
+                <w:color w:val="1C1C1C"/>
+                <w:spacing w:val="-2"/>
+                <w:w w:val="90"/>
+                <w:sz w:val="24"/>
+                <w:szCs w:val="24"/>
+                <w:u w:val="none" w:color="1C1C1C"/>
+              </w:rPr>
+              <w:t>Pemohon</w:t>
+            </w:r>
+            <w:proofErr w:type="spellEnd"/>
+            <w:r>
+              <w:rPr>
+                <w:b w:val="0"/>
+                <w:bCs w:val="0"/>
+                <w:color w:val="1C1C1C"/>
+                <w:spacing w:val="-2"/>
+                <w:w w:val="90"/>
+                <w:sz w:val="24"/>
+                <w:szCs w:val="24"/>
+                <w:u w:val="none" w:color="1C1C1C"/>
+              </w:rPr>
+              <w:t>,</w:t>
             </w:r>
           </w:p>
         </w:tc>
@@ -1490,7 +2329,59 @@
                 <w:szCs w:val="24"/>
                 <w:u w:val="none" w:color="1C1C1C"/>
               </w:rPr>
-              <w:t>{{nama}}</w:t>
+              <w:t>{</w:t>
+            </w:r>
+            <w:r>
+              <w:rPr>
+                <w:b w:val="0"/>
+                <w:bCs w:val="0"/>
+                <w:color w:val="1C1C1C"/>
+                <w:spacing w:val="-2"/>
+                <w:w w:val="90"/>
+                <w:sz w:val="24"/>
+                <w:szCs w:val="24"/>
+                <w:u w:val="none" w:color="1C1C1C"/>
+              </w:rPr>
+              <w:t>%</w:t>
+            </w:r>
+            <w:r>
+              <w:rPr>
+                <w:b w:val="0"/>
+                <w:bCs w:val="0"/>
+                <w:color w:val="1C1C1C"/>
+                <w:spacing w:val="-2"/>
+                <w:w w:val="90"/>
+                <w:sz w:val="24"/>
+                <w:szCs w:val="24"/>
+                <w:u w:val="none" w:color="1C1C1C"/>
+              </w:rPr>
+              <w:t>nama</w:t>
+            </w:r>
+            <w:r>
+              <w:rPr>
+                <w:b w:val="0"/>
+                <w:bCs w:val="0"/>
+                <w:color w:val="1C1C1C"/>
+                <w:spacing w:val="-2"/>
+                <w:w w:val="90"/>
+                <w:sz w:val="24"/>
+                <w:szCs w:val="24"/>
+                <w:u w:val="none" w:color="1C1C1C"/>
+              </w:rPr>
+              <w:t>%</w:t>
+            </w:r>
+            <w:r>
+              <w:rPr>
+                <w:b w:val="0"/>
+                <w:bCs w:val="0"/>
+                <w:color w:val="1C1C1C"/>
+                <w:spacing w:val="-2"/>
+                <w:w w:val="90"/>
+                <w:sz w:val="24"/>
+                <w:szCs w:val="24"/>
+                <w:u w:val="none" w:color="1C1C1C"/>
+              </w:rPr>
+              <w:t>}</w:t>
             </w:r>
           </w:p>
         </w:tc>
@@ -1555,6 +2446,7 @@
           <w:u w:color="1C1C1C"/>
         </w:rPr>
       </w:pPr>
+      <w:proofErr w:type="spellStart"/>
       <w:r>
         <w:rPr>
           <w:i/>
@@ -1566,8 +2458,37 @@
           <w:szCs w:val="24"/>
           <w:u w:color="1C1C1C"/>
         </w:rPr>
-        <w:t>Pemeriksaan persyaratan</w:t>
-      </w:r>
+        <w:t>Pemeriksaan</w:t>
+      </w:r>
+      <w:proofErr w:type="spellEnd"/>
+      <w:r>
+        <w:rPr>
+          <w:i/>
+          <w:iCs/>
+          <w:color w:val="1C1C1C"/>
+          <w:spacing w:val="-2"/>
+          <w:w w:val="90"/>
+          <w:sz w:val="24"/>
+          <w:szCs w:val="24"/>
+          <w:u w:color="1C1C1C"/>
+        </w:rPr>
+        <w:t xml:space="preserve"> </w:t>
+      </w:r>
+      <w:proofErr w:type="spellStart"/>
+      <w:r>
+        <w:rPr>
+          <w:i/>
+          <w:iCs/>
+          <w:color w:val="1C1C1C"/>
+          <w:spacing w:val="-2"/>
+          <w:w w:val="90"/>
+          <w:sz w:val="24"/>
+          <w:szCs w:val="24"/>
+          <w:u w:color="1C1C1C"/>
+        </w:rPr>
+        <w:t>persyaratan</w:t>
+      </w:r>
+      <w:proofErr w:type="spellEnd"/>
     </w:p>
     <w:p>
       <w:pPr>
@@ -1588,31 +2509,369 @@
           <w:u w:val="none" w:color="1C1C1C"/>
         </w:rPr>
       </w:pPr>
-      <w:r>
-        <w:rPr>
-          <w:b w:val="0"/>
-          <w:bCs w:val="0"/>
-          <w:color w:val="1C1C1C"/>
-          <w:spacing w:val="-2"/>
-          <w:w w:val="90"/>
-          <w:sz w:val="24"/>
-          <w:szCs w:val="24"/>
-          <w:u w:val="none" w:color="1C1C1C"/>
-        </w:rPr>
-        <w:t>Setelah diperiksa, mahasiswa tersebut di atas dinyatakan telah memenuhi</w:t>
-      </w:r>
-      <w:r>
-        <w:rPr>
-          <w:b w:val="0"/>
-          <w:bCs w:val="0"/>
-          <w:color w:val="1C1C1C"/>
-          <w:spacing w:val="-2"/>
-          <w:w w:val="90"/>
-          <w:sz w:val="24"/>
-          <w:szCs w:val="24"/>
-          <w:u w:val="none" w:color="1C1C1C"/>
-        </w:rPr>
-        <w:t xml:space="preserve"> persyaratan untuk melaksanakan Kerja Praktek.</w:t>
+      <w:proofErr w:type="spellStart"/>
+      <w:r>
+        <w:rPr>
+          <w:b w:val="0"/>
+          <w:bCs w:val="0"/>
+          <w:color w:val="1C1C1C"/>
+          <w:spacing w:val="-2"/>
+          <w:w w:val="90"/>
+          <w:sz w:val="24"/>
+          <w:szCs w:val="24"/>
+          <w:u w:val="none" w:color="1C1C1C"/>
+        </w:rPr>
+        <w:t>Setelah</w:t>
+      </w:r>
+      <w:proofErr w:type="spellEnd"/>
+      <w:r>
+        <w:rPr>
+          <w:b w:val="0"/>
+          <w:bCs w:val="0"/>
+          <w:color w:val="1C1C1C"/>
+          <w:spacing w:val="-2"/>
+          <w:w w:val="90"/>
+          <w:sz w:val="24"/>
+          <w:szCs w:val="24"/>
+          <w:u w:val="none" w:color="1C1C1C"/>
+        </w:rPr>
+        <w:t xml:space="preserve"> </w:t>
+      </w:r>
+      <w:proofErr w:type="spellStart"/>
+      <w:r>
+        <w:rPr>
+          <w:b w:val="0"/>
+          <w:bCs w:val="0"/>
+          <w:color w:val="1C1C1C"/>
+          <w:spacing w:val="-2"/>
+          <w:w w:val="90"/>
+          <w:sz w:val="24"/>
+          <w:szCs w:val="24"/>
+          <w:u w:val="none" w:color="1C1C1C"/>
+        </w:rPr>
+        <w:t>diperiksa</w:t>
+      </w:r>
+      <w:proofErr w:type="spellEnd"/>
+      <w:r>
+        <w:rPr>
+          <w:b w:val="0"/>
+          <w:bCs w:val="0"/>
+          <w:color w:val="1C1C1C"/>
+          <w:spacing w:val="-2"/>
+          <w:w w:val="90"/>
+          <w:sz w:val="24"/>
+          <w:szCs w:val="24"/>
+          <w:u w:val="none" w:color="1C1C1C"/>
+        </w:rPr>
+        <w:t xml:space="preserve">, </w:t>
+      </w:r>
+      <w:proofErr w:type="spellStart"/>
+      <w:r>
+        <w:rPr>
+          <w:b w:val="0"/>
+          <w:bCs w:val="0"/>
+          <w:color w:val="1C1C1C"/>
+          <w:spacing w:val="-2"/>
+          <w:w w:val="90"/>
+          <w:sz w:val="24"/>
+          <w:szCs w:val="24"/>
+          <w:u w:val="none" w:color="1C1C1C"/>
+        </w:rPr>
+        <w:t>mahasiswa</w:t>
+      </w:r>
+      <w:proofErr w:type="spellEnd"/>
+      <w:r>
+        <w:rPr>
+          <w:b w:val="0"/>
+          <w:bCs w:val="0"/>
+          <w:color w:val="1C1C1C"/>
+          <w:spacing w:val="-2"/>
+          <w:w w:val="90"/>
+          <w:sz w:val="24"/>
+          <w:szCs w:val="24"/>
+          <w:u w:val="none" w:color="1C1C1C"/>
+        </w:rPr>
+        <w:t xml:space="preserve"> </w:t>
+      </w:r>
+      <w:proofErr w:type="spellStart"/>
+      <w:r>
+        <w:rPr>
+          <w:b w:val="0"/>
+          <w:bCs w:val="0"/>
+          <w:color w:val="1C1C1C"/>
+          <w:spacing w:val="-2"/>
+          <w:w w:val="90"/>
+          <w:sz w:val="24"/>
+          <w:szCs w:val="24"/>
+          <w:u w:val="none" w:color="1C1C1C"/>
+        </w:rPr>
+        <w:t>tersebut</w:t>
+      </w:r>
+      <w:proofErr w:type="spellEnd"/>
+      <w:r>
+        <w:rPr>
+          <w:b w:val="0"/>
+          <w:bCs w:val="0"/>
+          <w:color w:val="1C1C1C"/>
+          <w:spacing w:val="-2"/>
+          <w:w w:val="90"/>
+          <w:sz w:val="24"/>
+          <w:szCs w:val="24"/>
+          <w:u w:val="none" w:color="1C1C1C"/>
+        </w:rPr>
+        <w:t xml:space="preserve"> di </w:t>
+      </w:r>
+      <w:proofErr w:type="spellStart"/>
+      <w:r>
+        <w:rPr>
+          <w:b w:val="0"/>
+          <w:bCs w:val="0"/>
+          <w:color w:val="1C1C1C"/>
+          <w:spacing w:val="-2"/>
+          <w:w w:val="90"/>
+          <w:sz w:val="24"/>
+          <w:szCs w:val="24"/>
+          <w:u w:val="none" w:color="1C1C1C"/>
+        </w:rPr>
+        <w:t>atas</w:t>
+      </w:r>
+      <w:proofErr w:type="spellEnd"/>
+      <w:r>
+        <w:rPr>
+          <w:b w:val="0"/>
+          <w:bCs w:val="0"/>
+          <w:color w:val="1C1C1C"/>
+          <w:spacing w:val="-2"/>
+          <w:w w:val="90"/>
+          <w:sz w:val="24"/>
+          <w:szCs w:val="24"/>
+          <w:u w:val="none" w:color="1C1C1C"/>
+        </w:rPr>
+        <w:t xml:space="preserve"> </w:t>
+      </w:r>
+      <w:proofErr w:type="spellStart"/>
+      <w:r>
+        <w:rPr>
+          <w:b w:val="0"/>
+          <w:bCs w:val="0"/>
+          <w:color w:val="1C1C1C"/>
+          <w:spacing w:val="-2"/>
+          <w:w w:val="90"/>
+          <w:sz w:val="24"/>
+          <w:szCs w:val="24"/>
+          <w:u w:val="none" w:color="1C1C1C"/>
+        </w:rPr>
+        <w:t>dinyatakan</w:t>
+      </w:r>
+      <w:proofErr w:type="spellEnd"/>
+      <w:r>
+        <w:rPr>
+          <w:b w:val="0"/>
+          <w:bCs w:val="0"/>
+          <w:color w:val="1C1C1C"/>
+          <w:spacing w:val="-2"/>
+          <w:w w:val="90"/>
+          <w:sz w:val="24"/>
+          <w:szCs w:val="24"/>
+          <w:u w:val="none" w:color="1C1C1C"/>
+        </w:rPr>
+        <w:t xml:space="preserve"> </w:t>
+      </w:r>
+      <w:proofErr w:type="spellStart"/>
+      <w:r>
+        <w:rPr>
+          <w:b w:val="0"/>
+          <w:bCs w:val="0"/>
+          <w:color w:val="1C1C1C"/>
+          <w:spacing w:val="-2"/>
+          <w:w w:val="90"/>
+          <w:sz w:val="24"/>
+          <w:szCs w:val="24"/>
+          <w:u w:val="none" w:color="1C1C1C"/>
+        </w:rPr>
+        <w:t>telah</w:t>
+      </w:r>
+      <w:proofErr w:type="spellEnd"/>
+      <w:r>
+        <w:rPr>
+          <w:b w:val="0"/>
+          <w:bCs w:val="0"/>
+          <w:color w:val="1C1C1C"/>
+          <w:spacing w:val="-2"/>
+          <w:w w:val="90"/>
+          <w:sz w:val="24"/>
+          <w:szCs w:val="24"/>
+          <w:u w:val="none" w:color="1C1C1C"/>
+        </w:rPr>
+        <w:t xml:space="preserve"> </w:t>
+      </w:r>
+      <w:proofErr w:type="spellStart"/>
+      <w:r>
+        <w:rPr>
+          <w:b w:val="0"/>
+          <w:bCs w:val="0"/>
+          <w:color w:val="1C1C1C"/>
+          <w:spacing w:val="-2"/>
+          <w:w w:val="90"/>
+          <w:sz w:val="24"/>
+          <w:szCs w:val="24"/>
+          <w:u w:val="none" w:color="1C1C1C"/>
+        </w:rPr>
+        <w:t>memenuhi</w:t>
+      </w:r>
+      <w:proofErr w:type="spellEnd"/>
+      <w:r>
+        <w:rPr>
+          <w:b w:val="0"/>
+          <w:bCs w:val="0"/>
+          <w:color w:val="1C1C1C"/>
+          <w:spacing w:val="-2"/>
+          <w:w w:val="90"/>
+          <w:sz w:val="24"/>
+          <w:szCs w:val="24"/>
+          <w:u w:val="none" w:color="1C1C1C"/>
+        </w:rPr>
+        <w:t xml:space="preserve"> </w:t>
+      </w:r>
+      <w:proofErr w:type="spellStart"/>
+      <w:r>
+        <w:rPr>
+          <w:b w:val="0"/>
+          <w:bCs w:val="0"/>
+          <w:color w:val="1C1C1C"/>
+          <w:spacing w:val="-2"/>
+          <w:w w:val="90"/>
+          <w:sz w:val="24"/>
+          <w:szCs w:val="24"/>
+          <w:u w:val="none" w:color="1C1C1C"/>
+        </w:rPr>
+        <w:t>persyaratan</w:t>
+      </w:r>
+      <w:proofErr w:type="spellEnd"/>
+      <w:r>
+        <w:rPr>
+          <w:b w:val="0"/>
+          <w:bCs w:val="0"/>
+          <w:color w:val="1C1C1C"/>
+          <w:spacing w:val="-2"/>
+          <w:w w:val="90"/>
+          <w:sz w:val="24"/>
+          <w:szCs w:val="24"/>
+          <w:u w:val="none" w:color="1C1C1C"/>
+        </w:rPr>
+        <w:t xml:space="preserve"> </w:t>
+      </w:r>
+      <w:proofErr w:type="spellStart"/>
+      <w:r>
+        <w:rPr>
+          <w:b w:val="0"/>
+          <w:bCs w:val="0"/>
+          <w:color w:val="1C1C1C"/>
+          <w:spacing w:val="-2"/>
+          <w:w w:val="90"/>
+          <w:sz w:val="24"/>
+          <w:szCs w:val="24"/>
+          <w:u w:val="none" w:color="1C1C1C"/>
+        </w:rPr>
+        <w:t>untuk</w:t>
+      </w:r>
+      <w:proofErr w:type="spellEnd"/>
+      <w:r>
+        <w:rPr>
+          <w:b w:val="0"/>
+          <w:bCs w:val="0"/>
+          <w:color w:val="1C1C1C"/>
+          <w:spacing w:val="-2"/>
+          <w:w w:val="90"/>
+          <w:sz w:val="24"/>
+          <w:szCs w:val="24"/>
+          <w:u w:val="none" w:color="1C1C1C"/>
+        </w:rPr>
+        <w:t xml:space="preserve"> </w:t>
+      </w:r>
+      <w:proofErr w:type="spellStart"/>
+      <w:r>
+        <w:rPr>
+          <w:b w:val="0"/>
+          <w:bCs w:val="0"/>
+          <w:color w:val="1C1C1C"/>
+          <w:spacing w:val="-2"/>
+          <w:w w:val="90"/>
+          <w:sz w:val="24"/>
+          <w:szCs w:val="24"/>
+          <w:u w:val="none" w:color="1C1C1C"/>
+        </w:rPr>
+        <w:t>melaksanakan</w:t>
+      </w:r>
+      <w:proofErr w:type="spellEnd"/>
+      <w:r>
+        <w:rPr>
+          <w:b w:val="0"/>
+          <w:bCs w:val="0"/>
+          <w:color w:val="1C1C1C"/>
+          <w:spacing w:val="-2"/>
+          <w:w w:val="90"/>
+          <w:sz w:val="24"/>
+          <w:szCs w:val="24"/>
+          <w:u w:val="none" w:color="1C1C1C"/>
+        </w:rPr>
+        <w:t xml:space="preserve"> </w:t>
+      </w:r>
+      <w:proofErr w:type="spellStart"/>
+      <w:r>
+        <w:rPr>
+          <w:b w:val="0"/>
+          <w:bCs w:val="0"/>
+          <w:color w:val="1C1C1C"/>
+          <w:spacing w:val="-2"/>
+          <w:w w:val="90"/>
+          <w:sz w:val="24"/>
+          <w:szCs w:val="24"/>
+          <w:u w:val="none" w:color="1C1C1C"/>
+        </w:rPr>
+        <w:t>Kerja</w:t>
+      </w:r>
+      <w:proofErr w:type="spellEnd"/>
+      <w:r>
+        <w:rPr>
+          <w:b w:val="0"/>
+          <w:bCs w:val="0"/>
+          <w:color w:val="1C1C1C"/>
+          <w:spacing w:val="-2"/>
+          <w:w w:val="90"/>
+          <w:sz w:val="24"/>
+          <w:szCs w:val="24"/>
+          <w:u w:val="none" w:color="1C1C1C"/>
+        </w:rPr>
+        <w:t xml:space="preserve"> </w:t>
+      </w:r>
+      <w:proofErr w:type="spellStart"/>
+      <w:r>
+        <w:rPr>
+          <w:b w:val="0"/>
+          <w:bCs w:val="0"/>
+          <w:color w:val="1C1C1C"/>
+          <w:spacing w:val="-2"/>
+          <w:w w:val="90"/>
+          <w:sz w:val="24"/>
+          <w:szCs w:val="24"/>
+          <w:u w:val="none" w:color="1C1C1C"/>
+        </w:rPr>
+        <w:t>Praktek</w:t>
+      </w:r>
+      <w:proofErr w:type="spellEnd"/>
+      <w:r>
+        <w:rPr>
+          <w:b w:val="0"/>
+          <w:bCs w:val="0"/>
+          <w:color w:val="1C1C1C"/>
+          <w:spacing w:val="-2"/>
+          <w:w w:val="90"/>
+          <w:sz w:val="24"/>
+          <w:szCs w:val="24"/>
+          <w:u w:val="none" w:color="1C1C1C"/>
+        </w:rPr>
+        <w:t>.</w:t>
       </w:r>
     </w:p>
     <w:p>
@@ -1654,44 +2913,128 @@
           <w:u w:color="1C1C1C"/>
         </w:rPr>
       </w:pPr>
-      <w:r>
-        <w:rPr>
-          <w:b w:val="0"/>
-          <w:bCs w:val="0"/>
-          <w:color w:val="1C1C1C"/>
-          <w:spacing w:val="-2"/>
-          <w:w w:val="90"/>
-          <w:sz w:val="24"/>
-          <w:szCs w:val="24"/>
-          <w:u w:val="none" w:color="1C1C1C"/>
-        </w:rPr>
-        <w:t xml:space="preserve">Diperiksa oleh Tata Usaha tanggal : </w:t>
-      </w:r>
-      <w:r>
-        <w:rPr>
-          <w:b w:val="0"/>
-          <w:bCs w:val="0"/>
-          <w:color w:val="1C1C1C"/>
-          <w:spacing w:val="-2"/>
-          <w:w w:val="90"/>
-          <w:sz w:val="24"/>
-          <w:szCs w:val="24"/>
-          <w:u w:val="none" w:color="1C1C1C"/>
-        </w:rPr>
-        <w:t>{{tanggal}}</w:t>
-      </w:r>
-      <w:r>
-        <w:rPr>
-          <w:b w:val="0"/>
-          <w:bCs w:val="0"/>
-          <w:color w:val="1C1C1C"/>
-          <w:spacing w:val="-2"/>
-          <w:w w:val="90"/>
-          <w:sz w:val="24"/>
-          <w:szCs w:val="24"/>
-          <w:u w:val="none" w:color="1C1C1C"/>
-        </w:rPr>
-        <w:t xml:space="preserve"> </w:t>
+      <w:proofErr w:type="spellStart"/>
+      <w:r>
+        <w:rPr>
+          <w:b w:val="0"/>
+          <w:bCs w:val="0"/>
+          <w:color w:val="1C1C1C"/>
+          <w:spacing w:val="-2"/>
+          <w:w w:val="90"/>
+          <w:sz w:val="24"/>
+          <w:szCs w:val="24"/>
+          <w:u w:val="none" w:color="1C1C1C"/>
+        </w:rPr>
+        <w:t>Diperiksa</w:t>
+      </w:r>
+      <w:proofErr w:type="spellEnd"/>
+      <w:r>
+        <w:rPr>
+          <w:b w:val="0"/>
+          <w:bCs w:val="0"/>
+          <w:color w:val="1C1C1C"/>
+          <w:spacing w:val="-2"/>
+          <w:w w:val="90"/>
+          <w:sz w:val="24"/>
+          <w:szCs w:val="24"/>
+          <w:u w:val="none" w:color="1C1C1C"/>
+        </w:rPr>
+        <w:t xml:space="preserve"> oleh Tata Usaha </w:t>
+      </w:r>
+      <w:proofErr w:type="spellStart"/>
+      <w:r>
+        <w:rPr>
+          <w:b w:val="0"/>
+          <w:bCs w:val="0"/>
+          <w:color w:val="1C1C1C"/>
+          <w:spacing w:val="-2"/>
+          <w:w w:val="90"/>
+          <w:sz w:val="24"/>
+          <w:szCs w:val="24"/>
+          <w:u w:val="none" w:color="1C1C1C"/>
+        </w:rPr>
+        <w:t>tanggal</w:t>
+      </w:r>
+      <w:proofErr w:type="spellEnd"/>
+      <w:r>
+        <w:rPr>
+          <w:b w:val="0"/>
+          <w:bCs w:val="0"/>
+          <w:color w:val="1C1C1C"/>
+          <w:spacing w:val="-2"/>
+          <w:w w:val="90"/>
+          <w:sz w:val="24"/>
+          <w:szCs w:val="24"/>
+          <w:u w:val="none" w:color="1C1C1C"/>
+        </w:rPr>
+        <w:t xml:space="preserve"> : </w:t>
+      </w:r>
+      <w:r>
+        <w:rPr>
+          <w:b w:val="0"/>
+          <w:bCs w:val="0"/>
+          <w:color w:val="1C1C1C"/>
+          <w:spacing w:val="-2"/>
+          <w:w w:val="90"/>
+          <w:sz w:val="24"/>
+          <w:szCs w:val="24"/>
+          <w:u w:val="none" w:color="1C1C1C"/>
+        </w:rPr>
+        <w:t>{</w:t>
+      </w:r>
+      <w:r>
+        <w:rPr>
+          <w:b w:val="0"/>
+          <w:bCs w:val="0"/>
+          <w:color w:val="1C1C1C"/>
+          <w:spacing w:val="-2"/>
+          <w:w w:val="90"/>
+          <w:sz w:val="24"/>
+          <w:szCs w:val="24"/>
+          <w:u w:val="none" w:color="1C1C1C"/>
+        </w:rPr>
+        <w:t>%</w:t>
+      </w:r>
+      <w:proofErr w:type="spellStart"/>
+      <w:r>
+        <w:rPr>
+          <w:b w:val="0"/>
+          <w:bCs w:val="0"/>
+          <w:color w:val="1C1C1C"/>
+          <w:spacing w:val="-2"/>
+          <w:w w:val="90"/>
+          <w:sz w:val="24"/>
+          <w:szCs w:val="24"/>
+          <w:u w:val="none" w:color="1C1C1C"/>
+        </w:rPr>
+        <w:t>tanggal</w:t>
+      </w:r>
+      <w:proofErr w:type="spellEnd"/>
+      <w:r>
+        <w:rPr>
+          <w:b w:val="0"/>
+          <w:bCs w:val="0"/>
+          <w:color w:val="1C1C1C"/>
+          <w:spacing w:val="-2"/>
+          <w:w w:val="90"/>
+          <w:sz w:val="24"/>
+          <w:szCs w:val="24"/>
+          <w:u w:val="none" w:color="1C1C1C"/>
+        </w:rPr>
+        <w:t>%</w:t>
+      </w:r>
+      <w:r>
+        <w:rPr>
+          <w:b w:val="0"/>
+          <w:bCs w:val="0"/>
+          <w:color w:val="1C1C1C"/>
+          <w:spacing w:val="-2"/>
+          <w:w w:val="90"/>
+          <w:sz w:val="24"/>
+          <w:szCs w:val="24"/>
+          <w:u w:val="none" w:color="1C1C1C"/>
+        </w:rPr>
+        <w:t xml:space="preserve">} </w:t>
       </w:r>
       <w:r>
         <w:rPr>
@@ -1726,6 +3069,7 @@
           <w:u w:val="none" w:color="1C1C1C"/>
         </w:rPr>
       </w:pPr>
+      <w:proofErr w:type="spellStart"/>
       <w:r>
         <w:rPr>
           <w:i/>
@@ -1739,6 +3083,7 @@
         </w:rPr>
         <w:t>Persetujuan</w:t>
       </w:r>
+      <w:proofErr w:type="spellEnd"/>
     </w:p>
     <w:p>
       <w:pPr>
@@ -1759,19 +3104,189 @@
           <w:u w:val="none" w:color="1C1C1C"/>
         </w:rPr>
       </w:pPr>
-      <w:r>
-        <w:rPr>
-          <w:b w:val="0"/>
-          <w:bCs w:val="0"/>
-          <w:color w:val="1C1C1C"/>
-          <w:spacing w:val="-2"/>
-          <w:w w:val="90"/>
-          <w:sz w:val="24"/>
-          <w:szCs w:val="24"/>
-          <w:u w:val="none" w:color="1C1C1C"/>
-        </w:rPr>
-        <w:t>Berdasarkan pemeriksaan di atas, permohonan Saudara disetujui dengan</w:t>
-      </w:r>
+      <w:proofErr w:type="spellStart"/>
+      <w:r>
+        <w:rPr>
+          <w:b w:val="0"/>
+          <w:bCs w:val="0"/>
+          <w:color w:val="1C1C1C"/>
+          <w:spacing w:val="-2"/>
+          <w:w w:val="90"/>
+          <w:sz w:val="24"/>
+          <w:szCs w:val="24"/>
+          <w:u w:val="none" w:color="1C1C1C"/>
+        </w:rPr>
+        <w:t>Berdasarkan</w:t>
+      </w:r>
+      <w:proofErr w:type="spellEnd"/>
+      <w:r>
+        <w:rPr>
+          <w:b w:val="0"/>
+          <w:bCs w:val="0"/>
+          <w:color w:val="1C1C1C"/>
+          <w:spacing w:val="-2"/>
+          <w:w w:val="90"/>
+          <w:sz w:val="24"/>
+          <w:szCs w:val="24"/>
+          <w:u w:val="none" w:color="1C1C1C"/>
+        </w:rPr>
+        <w:t xml:space="preserve"> </w:t>
+      </w:r>
+      <w:proofErr w:type="spellStart"/>
+      <w:r>
+        <w:rPr>
+          <w:b w:val="0"/>
+          <w:bCs w:val="0"/>
+          <w:color w:val="1C1C1C"/>
+          <w:spacing w:val="-2"/>
+          <w:w w:val="90"/>
+          <w:sz w:val="24"/>
+          <w:szCs w:val="24"/>
+          <w:u w:val="none" w:color="1C1C1C"/>
+        </w:rPr>
+        <w:t>pemeriksaan</w:t>
+      </w:r>
+      <w:proofErr w:type="spellEnd"/>
+      <w:r>
+        <w:rPr>
+          <w:b w:val="0"/>
+          <w:bCs w:val="0"/>
+          <w:color w:val="1C1C1C"/>
+          <w:spacing w:val="-2"/>
+          <w:w w:val="90"/>
+          <w:sz w:val="24"/>
+          <w:szCs w:val="24"/>
+          <w:u w:val="none" w:color="1C1C1C"/>
+        </w:rPr>
+        <w:t xml:space="preserve"> di </w:t>
+      </w:r>
+      <w:proofErr w:type="spellStart"/>
+      <w:r>
+        <w:rPr>
+          <w:b w:val="0"/>
+          <w:bCs w:val="0"/>
+          <w:color w:val="1C1C1C"/>
+          <w:spacing w:val="-2"/>
+          <w:w w:val="90"/>
+          <w:sz w:val="24"/>
+          <w:szCs w:val="24"/>
+          <w:u w:val="none" w:color="1C1C1C"/>
+        </w:rPr>
+        <w:t>atas</w:t>
+      </w:r>
+      <w:proofErr w:type="spellEnd"/>
+      <w:r>
+        <w:rPr>
+          <w:b w:val="0"/>
+          <w:bCs w:val="0"/>
+          <w:color w:val="1C1C1C"/>
+          <w:spacing w:val="-2"/>
+          <w:w w:val="90"/>
+          <w:sz w:val="24"/>
+          <w:szCs w:val="24"/>
+          <w:u w:val="none" w:color="1C1C1C"/>
+        </w:rPr>
+        <w:t xml:space="preserve">, </w:t>
+      </w:r>
+      <w:proofErr w:type="spellStart"/>
+      <w:r>
+        <w:rPr>
+          <w:b w:val="0"/>
+          <w:bCs w:val="0"/>
+          <w:color w:val="1C1C1C"/>
+          <w:spacing w:val="-2"/>
+          <w:w w:val="90"/>
+          <w:sz w:val="24"/>
+          <w:szCs w:val="24"/>
+          <w:u w:val="none" w:color="1C1C1C"/>
+        </w:rPr>
+        <w:t>permohonan</w:t>
+      </w:r>
+      <w:proofErr w:type="spellEnd"/>
+      <w:r>
+        <w:rPr>
+          <w:b w:val="0"/>
+          <w:bCs w:val="0"/>
+          <w:color w:val="1C1C1C"/>
+          <w:spacing w:val="-2"/>
+          <w:w w:val="90"/>
+          <w:sz w:val="24"/>
+          <w:szCs w:val="24"/>
+          <w:u w:val="none" w:color="1C1C1C"/>
+        </w:rPr>
+        <w:t xml:space="preserve"> </w:t>
+      </w:r>
+      <w:proofErr w:type="spellStart"/>
+      <w:r>
+        <w:rPr>
+          <w:b w:val="0"/>
+          <w:bCs w:val="0"/>
+          <w:color w:val="1C1C1C"/>
+          <w:spacing w:val="-2"/>
+          <w:w w:val="90"/>
+          <w:sz w:val="24"/>
+          <w:szCs w:val="24"/>
+          <w:u w:val="none" w:color="1C1C1C"/>
+        </w:rPr>
+        <w:t>Saudara</w:t>
+      </w:r>
+      <w:proofErr w:type="spellEnd"/>
+      <w:r>
+        <w:rPr>
+          <w:b w:val="0"/>
+          <w:bCs w:val="0"/>
+          <w:color w:val="1C1C1C"/>
+          <w:spacing w:val="-2"/>
+          <w:w w:val="90"/>
+          <w:sz w:val="24"/>
+          <w:szCs w:val="24"/>
+          <w:u w:val="none" w:color="1C1C1C"/>
+        </w:rPr>
+        <w:t xml:space="preserve"> </w:t>
+      </w:r>
+      <w:proofErr w:type="spellStart"/>
+      <w:r>
+        <w:rPr>
+          <w:b w:val="0"/>
+          <w:bCs w:val="0"/>
+          <w:color w:val="1C1C1C"/>
+          <w:spacing w:val="-2"/>
+          <w:w w:val="90"/>
+          <w:sz w:val="24"/>
+          <w:szCs w:val="24"/>
+          <w:u w:val="none" w:color="1C1C1C"/>
+        </w:rPr>
+        <w:t>disetujui</w:t>
+      </w:r>
+      <w:proofErr w:type="spellEnd"/>
+      <w:r>
+        <w:rPr>
+          <w:b w:val="0"/>
+          <w:bCs w:val="0"/>
+          <w:color w:val="1C1C1C"/>
+          <w:spacing w:val="-2"/>
+          <w:w w:val="90"/>
+          <w:sz w:val="24"/>
+          <w:szCs w:val="24"/>
+          <w:u w:val="none" w:color="1C1C1C"/>
+        </w:rPr>
+        <w:t xml:space="preserve"> </w:t>
+      </w:r>
+      <w:proofErr w:type="spellStart"/>
+      <w:r>
+        <w:rPr>
+          <w:b w:val="0"/>
+          <w:bCs w:val="0"/>
+          <w:color w:val="1C1C1C"/>
+          <w:spacing w:val="-2"/>
+          <w:w w:val="90"/>
+          <w:sz w:val="24"/>
+          <w:szCs w:val="24"/>
+          <w:u w:val="none" w:color="1C1C1C"/>
+        </w:rPr>
+        <w:t>dengan</w:t>
+      </w:r>
+      <w:proofErr w:type="spellEnd"/>
       <w:r>
         <w:rPr>
           <w:b w:val="0"/>
@@ -1797,20 +3312,100 @@
           <w:u w:val="none" w:color="1C1C1C"/>
         </w:rPr>
         <w:br/>
-        <w:t xml:space="preserve">Dosen Pembimbing : </w:t>
-      </w:r>
-      <w:r>
-        <w:rPr>
-          <w:b w:val="0"/>
-          <w:bCs w:val="0"/>
-          <w:color w:val="1C1C1C"/>
-          <w:spacing w:val="-2"/>
-          <w:w w:val="90"/>
-          <w:sz w:val="24"/>
-          <w:szCs w:val="24"/>
-          <w:u w:val="none" w:color="1C1C1C"/>
-        </w:rPr>
-        <w:t>{{dpa}}</w:t>
+        <w:t xml:space="preserve">Dosen </w:t>
+      </w:r>
+      <w:proofErr w:type="spellStart"/>
+      <w:r>
+        <w:rPr>
+          <w:b w:val="0"/>
+          <w:bCs w:val="0"/>
+          <w:color w:val="1C1C1C"/>
+          <w:spacing w:val="-2"/>
+          <w:w w:val="90"/>
+          <w:sz w:val="24"/>
+          <w:szCs w:val="24"/>
+          <w:u w:val="none" w:color="1C1C1C"/>
+        </w:rPr>
+        <w:t>Pembimbing</w:t>
+      </w:r>
+      <w:proofErr w:type="spellEnd"/>
+      <w:r>
+        <w:rPr>
+          <w:b w:val="0"/>
+          <w:bCs w:val="0"/>
+          <w:color w:val="1C1C1C"/>
+          <w:spacing w:val="-2"/>
+          <w:w w:val="90"/>
+          <w:sz w:val="24"/>
+          <w:szCs w:val="24"/>
+          <w:u w:val="none" w:color="1C1C1C"/>
+        </w:rPr>
+        <w:t xml:space="preserve"> : </w:t>
+      </w:r>
+      <w:r>
+        <w:rPr>
+          <w:b w:val="0"/>
+          <w:bCs w:val="0"/>
+          <w:color w:val="1C1C1C"/>
+          <w:spacing w:val="-2"/>
+          <w:w w:val="90"/>
+          <w:sz w:val="24"/>
+          <w:szCs w:val="24"/>
+          <w:u w:val="none" w:color="1C1C1C"/>
+        </w:rPr>
+        <w:t>{</w:t>
+      </w:r>
+      <w:r>
+        <w:rPr>
+          <w:b w:val="0"/>
+          <w:bCs w:val="0"/>
+          <w:color w:val="1C1C1C"/>
+          <w:spacing w:val="-2"/>
+          <w:w w:val="90"/>
+          <w:sz w:val="24"/>
+          <w:szCs w:val="24"/>
+          <w:u w:val="none" w:color="1C1C1C"/>
+        </w:rPr>
+        <w:t>%</w:t>
+      </w:r>
+      <w:r>
+        <w:rPr>
+          <w:b w:val="0"/>
+          <w:bCs w:val="0"/>
+          <w:color w:val="1C1C1C"/>
+          <w:spacing w:val="-2"/>
+          <w:w w:val="90"/>
+          <w:sz w:val="24"/>
+          <w:szCs w:val="24"/>
+          <w:u w:val="none" w:color="1C1C1C"/>
+        </w:rPr>
+        <w:t>dpa</w:t>
+      </w:r>
+      <w:r>
+        <w:rPr>
+          <w:b w:val="0"/>
+          <w:bCs w:val="0"/>
+          <w:color w:val="1C1C1C"/>
+          <w:spacing w:val="-2"/>
+          <w:w w:val="90"/>
+          <w:sz w:val="24"/>
+          <w:szCs w:val="24"/>
+          <w:u w:val="none" w:color="1C1C1C"/>
+        </w:rPr>
+        <w:t>%</w:t>
+      </w:r>
+      <w:r>
+        <w:rPr>
+          <w:b w:val="0"/>
+          <w:bCs w:val="0"/>
+          <w:color w:val="1C1C1C"/>
+          <w:spacing w:val="-2"/>
+          <w:w w:val="90"/>
+          <w:sz w:val="24"/>
+          <w:szCs w:val="24"/>
+          <w:u w:val="none" w:color="1C1C1C"/>
+        </w:rPr>
+        <w:t>}</w:t>
       </w:r>
     </w:p>
     <w:p>
@@ -1917,7 +3512,61 @@
                 <w:szCs w:val="24"/>
                 <w:u w:val="none" w:color="1C1C1C"/>
               </w:rPr>
-              <w:t>{{tanggal}}</w:t>
+              <w:t>{</w:t>
+            </w:r>
+            <w:r>
+              <w:rPr>
+                <w:b w:val="0"/>
+                <w:bCs w:val="0"/>
+                <w:color w:val="1C1C1C"/>
+                <w:spacing w:val="-2"/>
+                <w:w w:val="90"/>
+                <w:sz w:val="24"/>
+                <w:szCs w:val="24"/>
+                <w:u w:val="none" w:color="1C1C1C"/>
+              </w:rPr>
+              <w:t>%</w:t>
+            </w:r>
+            <w:proofErr w:type="spellStart"/>
+            <w:r>
+              <w:rPr>
+                <w:b w:val="0"/>
+                <w:bCs w:val="0"/>
+                <w:color w:val="1C1C1C"/>
+                <w:spacing w:val="-2"/>
+                <w:w w:val="90"/>
+                <w:sz w:val="24"/>
+                <w:szCs w:val="24"/>
+                <w:u w:val="none" w:color="1C1C1C"/>
+              </w:rPr>
+              <w:t>tanggal</w:t>
+            </w:r>
+            <w:proofErr w:type="spellEnd"/>
+            <w:r>
+              <w:rPr>
+                <w:b w:val="0"/>
+                <w:bCs w:val="0"/>
+                <w:color w:val="1C1C1C"/>
+                <w:spacing w:val="-2"/>
+                <w:w w:val="90"/>
+                <w:sz w:val="24"/>
+                <w:szCs w:val="24"/>
+                <w:u w:val="none" w:color="1C1C1C"/>
+              </w:rPr>
+              <w:t>%</w:t>
+            </w:r>
+            <w:r>
+              <w:rPr>
+                <w:b w:val="0"/>
+                <w:bCs w:val="0"/>
+                <w:color w:val="1C1C1C"/>
+                <w:spacing w:val="-2"/>
+                <w:w w:val="90"/>
+                <w:sz w:val="24"/>
+                <w:szCs w:val="24"/>
+                <w:u w:val="none" w:color="1C1C1C"/>
+              </w:rPr>
+              <w:t>}</w:t>
             </w:r>
           </w:p>
         </w:tc>
@@ -1964,18 +3613,33 @@
                 <w:u w:val="none" w:color="1C1C1C"/>
               </w:rPr>
             </w:pPr>
-            <w:r>
-              <w:rPr>
-                <w:b w:val="0"/>
-                <w:bCs w:val="0"/>
-                <w:color w:val="1C1C1C"/>
-                <w:spacing w:val="-2"/>
-                <w:w w:val="90"/>
-                <w:sz w:val="24"/>
-                <w:szCs w:val="24"/>
-                <w:u w:val="none" w:color="1C1C1C"/>
-              </w:rPr>
-              <w:t>Ketua Program Studi,</w:t>
+            <w:proofErr w:type="spellStart"/>
+            <w:r>
+              <w:rPr>
+                <w:b w:val="0"/>
+                <w:bCs w:val="0"/>
+                <w:color w:val="1C1C1C"/>
+                <w:spacing w:val="-2"/>
+                <w:w w:val="90"/>
+                <w:sz w:val="24"/>
+                <w:szCs w:val="24"/>
+                <w:u w:val="none" w:color="1C1C1C"/>
+              </w:rPr>
+              <w:t>Ketua</w:t>
+            </w:r>
+            <w:proofErr w:type="spellEnd"/>
+            <w:r>
+              <w:rPr>
+                <w:b w:val="0"/>
+                <w:bCs w:val="0"/>
+                <w:color w:val="1C1C1C"/>
+                <w:spacing w:val="-2"/>
+                <w:w w:val="90"/>
+                <w:sz w:val="24"/>
+                <w:szCs w:val="24"/>
+                <w:u w:val="none" w:color="1C1C1C"/>
+              </w:rPr>
+              <w:t xml:space="preserve"> Program Studi,</w:t>
             </w:r>
           </w:p>
           <w:p>
@@ -2041,62 +3705,6 @@
                 <w:u w:val="none" w:color="1C1C1C"/>
               </w:rPr>
             </w:pPr>
-            <w:r>
-              <w:rPr>
-                <w:b w:val="0"/>
-                <w:bCs w:val="0"/>
-                <w:noProof/>
-                <w:u w:val="none"/>
-              </w:rPr>
-              <w:drawing>
-                <wp:inline distT="0" distB="0" distL="0" distR="0" wp14:anchorId="2FD28C90" wp14:editId="3345D6B0">
-                  <wp:extent cx="735965" cy="735965"/>
-                  <wp:effectExtent l="0" t="0" r="6985" b="6985"/>
-                  <wp:docPr id="1420013662" name="Picture 1"/>
-                  <wp:cNvGraphicFramePr>
-                    <a:graphicFrameLocks xmlns:a="http://schemas.openxmlformats.org/drawingml/2006/main" noChangeAspect="1"/>
-                  </wp:cNvGraphicFramePr>
-                  <a:graphic xmlns:a="http://schemas.openxmlformats.org/drawingml/2006/main">
-                    <a:graphicData uri="http://schemas.openxmlformats.org/drawingml/2006/picture">
-                      <pic:pic xmlns:pic="http://schemas.openxmlformats.org/drawingml/2006/picture">
-                        <pic:nvPicPr>
-                          <pic:cNvPr id="0" name="Picture 4"/>
-                          <pic:cNvPicPr>
-                            <a:picLocks noChangeAspect="1" noChangeArrowheads="1"/>
-                          </pic:cNvPicPr>
-                        </pic:nvPicPr>
-                        <pic:blipFill>
-                          <a:blip r:embed="rId4">
-                            <a:extLst>
-                              <a:ext uri="{28A0092B-C50C-407E-A947-70E740481C1C}">
-                                <a14:useLocalDpi xmlns:a14="http://schemas.microsoft.com/office/drawing/2010/main" val="0"/>
-                              </a:ext>
-                            </a:extLst>
-                          </a:blip>
-                          <a:srcRect/>
-                          <a:stretch>
-                            <a:fillRect/>
-                          </a:stretch>
-                        </pic:blipFill>
-                        <pic:spPr bwMode="auto">
-                          <a:xfrm>
-                            <a:off x="0" y="0"/>
-                            <a:ext cx="735965" cy="735965"/>
-                          </a:xfrm>
-                          <a:prstGeom prst="rect">
-                            <a:avLst/>
-                          </a:prstGeom>
-                          <a:noFill/>
-                          <a:ln>
-                            <a:noFill/>
-                          </a:ln>
-                        </pic:spPr>
-                      </pic:pic>
-                    </a:graphicData>
-                  </a:graphic>
-                </wp:inline>
-              </w:drawing>
-            </w:r>
           </w:p>
         </w:tc>
       </w:tr>
@@ -2142,18 +3750,89 @@
                 <w:u w:val="none" w:color="1C1C1C"/>
               </w:rPr>
             </w:pPr>
-            <w:r>
-              <w:rPr>
-                <w:b w:val="0"/>
-                <w:bCs w:val="0"/>
-                <w:color w:val="1C1C1C"/>
-                <w:spacing w:val="-2"/>
-                <w:w w:val="90"/>
-                <w:sz w:val="24"/>
-                <w:szCs w:val="24"/>
-                <w:u w:val="none" w:color="1C1C1C"/>
-              </w:rPr>
-              <w:t>Nurwahyu Alamsyah, S.Kom., M.Kom., M.I</w:t>
+            <w:proofErr w:type="spellStart"/>
+            <w:r>
+              <w:rPr>
+                <w:b w:val="0"/>
+                <w:bCs w:val="0"/>
+                <w:color w:val="1C1C1C"/>
+                <w:spacing w:val="-2"/>
+                <w:w w:val="90"/>
+                <w:sz w:val="24"/>
+                <w:szCs w:val="24"/>
+                <w:u w:val="none" w:color="1C1C1C"/>
+              </w:rPr>
+              <w:t>Nurwahyu</w:t>
+            </w:r>
+            <w:proofErr w:type="spellEnd"/>
+            <w:r>
+              <w:rPr>
+                <w:b w:val="0"/>
+                <w:bCs w:val="0"/>
+                <w:color w:val="1C1C1C"/>
+                <w:spacing w:val="-2"/>
+                <w:w w:val="90"/>
+                <w:sz w:val="24"/>
+                <w:szCs w:val="24"/>
+                <w:u w:val="none" w:color="1C1C1C"/>
+              </w:rPr>
+              <w:t xml:space="preserve"> Alamsyah, </w:t>
+            </w:r>
+            <w:proofErr w:type="spellStart"/>
+            <w:r>
+              <w:rPr>
+                <w:b w:val="0"/>
+                <w:bCs w:val="0"/>
+                <w:color w:val="1C1C1C"/>
+                <w:spacing w:val="-2"/>
+                <w:w w:val="90"/>
+                <w:sz w:val="24"/>
+                <w:szCs w:val="24"/>
+                <w:u w:val="none" w:color="1C1C1C"/>
+              </w:rPr>
+              <w:t>S.Kom</w:t>
+            </w:r>
+            <w:proofErr w:type="spellEnd"/>
+            <w:r>
+              <w:rPr>
+                <w:b w:val="0"/>
+                <w:bCs w:val="0"/>
+                <w:color w:val="1C1C1C"/>
+                <w:spacing w:val="-2"/>
+                <w:w w:val="90"/>
+                <w:sz w:val="24"/>
+                <w:szCs w:val="24"/>
+                <w:u w:val="none" w:color="1C1C1C"/>
+              </w:rPr>
+              <w:t xml:space="preserve">., </w:t>
+            </w:r>
+            <w:proofErr w:type="spellStart"/>
+            <w:r>
+              <w:rPr>
+                <w:b w:val="0"/>
+                <w:bCs w:val="0"/>
+                <w:color w:val="1C1C1C"/>
+                <w:spacing w:val="-2"/>
+                <w:w w:val="90"/>
+                <w:sz w:val="24"/>
+                <w:szCs w:val="24"/>
+                <w:u w:val="none" w:color="1C1C1C"/>
+              </w:rPr>
+              <w:t>M.Kom</w:t>
+            </w:r>
+            <w:proofErr w:type="spellEnd"/>
+            <w:r>
+              <w:rPr>
+                <w:b w:val="0"/>
+                <w:bCs w:val="0"/>
+                <w:color w:val="1C1C1C"/>
+                <w:spacing w:val="-2"/>
+                <w:w w:val="90"/>
+                <w:sz w:val="24"/>
+                <w:szCs w:val="24"/>
+                <w:u w:val="none" w:color="1C1C1C"/>
+              </w:rPr>
+              <w:t>., M.I</w:t>
             </w:r>
             <w:r>
               <w:rPr>

</xml_diff>